<commit_message>
Documentacion: apartado de ingenieria de prompts
Nueva seccion 8 de la documentacion tecnica (las siguientes corren un numero):
como esta compuesto el prompt, por que el modelo no calcula, por que el glosario
es data y no prompt, que error previene cada regla de comparacion, por que CSV,
el esquema como parte del prompt, los avisos como grounding defensivo, los
parametros de inferencia, el prompt real de ejemplo, como iterarlo y que se dejo
afuera a proposito.

El resumen tecnico suma un bloque corto con las cinco decisiones que lo definen.

Co-Authored-By: Claude Opus 5 <noreply@anthropic.com>
</commit_message>
<xml_diff>
--- a/docs/resumen-tecnico.docx
+++ b/docs/resumen-tecnico.docx
@@ -1856,6 +1856,496 @@
       </w:r>
       <w:r>
         <w:t xml:space="preserve">. Si el modelo rechaza el pedido, se corta por longitud o no se puede parsear, es un error explícito: ese dominio queda sin análisis esa semana en vez de escribir un resumen a medias.</w:t>
+      </w:r>
+    </w:p>
+    <w:p>
+      <w:pPr>
+        <w:pStyle w:val="Heading1"/>
+        <w:spacing w:after="140" w:before="300"/>
+      </w:pPr>
+      <w:r>
+        <w:t xml:space="preserve">Cómo está armado el prompt</w:t>
+      </w:r>
+    </w:p>
+    <w:tbl>
+      <w:tblPr>
+        <w:tblW w:type="dxa" w:w="9360"/>
+        <w:tblBorders>
+          <w:top w:val="single" w:color="auto" w:sz="4"/>
+          <w:left w:val="single" w:color="auto" w:sz="4"/>
+          <w:bottom w:val="single" w:color="auto" w:sz="4"/>
+          <w:right w:val="single" w:color="auto" w:sz="4"/>
+          <w:insideH w:val="single" w:color="auto" w:sz="4"/>
+          <w:insideV w:val="single" w:color="auto" w:sz="4"/>
+        </w:tblBorders>
+      </w:tblPr>
+      <w:tblGrid>
+        <w:gridCol w:w="1073"/>
+        <w:gridCol w:w="7273"/>
+        <w:gridCol w:w="1014"/>
+      </w:tblGrid>
+      <w:tr>
+        <w:trPr>
+          <w:tblHeader/>
+        </w:trPr>
+        <w:tc>
+          <w:tcPr>
+            <w:tcW w:type="dxa" w:w="1073"/>
+            <w:shd w:fill="E8EDF3" w:val="clear"/>
+            <w:tcMar>
+              <w:top w:type="dxa" w:w="60"/>
+              <w:left w:type="dxa" w:w="110"/>
+              <w:bottom w:type="dxa" w:w="60"/>
+              <w:right w:type="dxa" w:w="110"/>
+            </w:tcMar>
+          </w:tcPr>
+          <w:p>
+            <w:pPr>
+              <w:spacing w:after="0" w:before="0"/>
+            </w:pPr>
+            <w:r>
+              <w:rPr>
+                <w:b/>
+                <w:bCs/>
+                <w:sz w:val="19"/>
+                <w:szCs w:val="19"/>
+              </w:rPr>
+              <w:t xml:space="preserve">Pieza</w:t>
+            </w:r>
+          </w:p>
+        </w:tc>
+        <w:tc>
+          <w:tcPr>
+            <w:tcW w:type="dxa" w:w="7273"/>
+            <w:shd w:fill="E8EDF3" w:val="clear"/>
+            <w:tcMar>
+              <w:top w:type="dxa" w:w="60"/>
+              <w:left w:type="dxa" w:w="110"/>
+              <w:bottom w:type="dxa" w:w="60"/>
+              <w:right w:type="dxa" w:w="110"/>
+            </w:tcMar>
+          </w:tcPr>
+          <w:p>
+            <w:pPr>
+              <w:spacing w:after="0" w:before="0"/>
+            </w:pPr>
+            <w:r>
+              <w:rPr>
+                <w:b/>
+                <w:bCs/>
+                <w:sz w:val="19"/>
+                <w:szCs w:val="19"/>
+              </w:rPr>
+              <w:t xml:space="preserve">Qué lleva</w:t>
+            </w:r>
+          </w:p>
+        </w:tc>
+        <w:tc>
+          <w:tcPr>
+            <w:tcW w:type="dxa" w:w="1014"/>
+            <w:shd w:fill="E8EDF3" w:val="clear"/>
+            <w:tcMar>
+              <w:top w:type="dxa" w:w="60"/>
+              <w:left w:type="dxa" w:w="110"/>
+              <w:bottom w:type="dxa" w:w="60"/>
+              <w:right w:type="dxa" w:w="110"/>
+            </w:tcMar>
+          </w:tcPr>
+          <w:p>
+            <w:pPr>
+              <w:spacing w:after="0" w:before="0"/>
+            </w:pPr>
+            <w:r>
+              <w:rPr>
+                <w:b/>
+                <w:bCs/>
+                <w:sz w:val="19"/>
+                <w:szCs w:val="19"/>
+              </w:rPr>
+              <w:t xml:space="preserve">Cambia cuando</w:t>
+            </w:r>
+          </w:p>
+        </w:tc>
+      </w:tr>
+      <w:tr>
+        <w:tc>
+          <w:tcPr>
+            <w:tcW w:type="dxa" w:w="1073"/>
+            <w:tcMar>
+              <w:top w:type="dxa" w:w="60"/>
+              <w:left w:type="dxa" w:w="110"/>
+              <w:bottom w:type="dxa" w:w="60"/>
+              <w:right w:type="dxa" w:w="110"/>
+            </w:tcMar>
+          </w:tcPr>
+          <w:p>
+            <w:pPr>
+              <w:spacing w:after="0" w:before="0"/>
+            </w:pPr>
+            <w:r>
+              <w:rPr>
+                <w:b/>
+                <w:bCs/>
+                <w:sz w:val="19"/>
+                <w:szCs w:val="19"/>
+              </w:rPr>
+              <w:t xml:space="preserve">System prompt</w:t>
+            </w:r>
+          </w:p>
+        </w:tc>
+        <w:tc>
+          <w:tcPr>
+            <w:tcW w:type="dxa" w:w="7273"/>
+            <w:tcMar>
+              <w:top w:type="dxa" w:w="60"/>
+              <w:left w:type="dxa" w:w="110"/>
+              <w:bottom w:type="dxa" w:w="60"/>
+              <w:right w:type="dxa" w:w="110"/>
+            </w:tcMar>
+          </w:tcPr>
+          <w:p>
+            <w:pPr>
+              <w:spacing w:after="0" w:before="0"/>
+            </w:pPr>
+            <w:r>
+              <w:rPr>
+                <w:sz w:val="19"/>
+                <w:szCs w:val="19"/>
+              </w:rPr>
+              <w:t xml:space="preserve">Rol y audiencia, qué es una foto acumulada, el contrato de las tablas, el </w:t>
+            </w:r>
+            <w:r>
+              <w:rPr>
+                <w:b/>
+                <w:bCs/>
+                <w:sz w:val="19"/>
+                <w:szCs w:val="19"/>
+              </w:rPr>
+              <w:t xml:space="preserve">glosario del dominio</w:t>
+            </w:r>
+            <w:r>
+              <w:rPr>
+                <w:sz w:val="19"/>
+                <w:szCs w:val="19"/>
+              </w:rPr>
+              <w:t xml:space="preserve"> y las reglas de comparación</w:t>
+            </w:r>
+          </w:p>
+        </w:tc>
+        <w:tc>
+          <w:tcPr>
+            <w:tcW w:type="dxa" w:w="1014"/>
+            <w:tcMar>
+              <w:top w:type="dxa" w:w="60"/>
+              <w:left w:type="dxa" w:w="110"/>
+              <w:bottom w:type="dxa" w:w="60"/>
+              <w:right w:type="dxa" w:w="110"/>
+            </w:tcMar>
+          </w:tcPr>
+          <w:p>
+            <w:pPr>
+              <w:spacing w:after="0" w:before="0"/>
+            </w:pPr>
+            <w:r>
+              <w:rPr>
+                <w:sz w:val="19"/>
+                <w:szCs w:val="19"/>
+              </w:rPr>
+              <w:t xml:space="preserve">Cambia el dominio</w:t>
+            </w:r>
+          </w:p>
+        </w:tc>
+      </w:tr>
+      <w:tr>
+        <w:tc>
+          <w:tcPr>
+            <w:tcW w:type="dxa" w:w="1073"/>
+            <w:tcMar>
+              <w:top w:type="dxa" w:w="60"/>
+              <w:left w:type="dxa" w:w="110"/>
+              <w:bottom w:type="dxa" w:w="60"/>
+              <w:right w:type="dxa" w:w="110"/>
+            </w:tcMar>
+          </w:tcPr>
+          <w:p>
+            <w:pPr>
+              <w:spacing w:after="0" w:before="0"/>
+            </w:pPr>
+            <w:r>
+              <w:rPr>
+                <w:b/>
+                <w:bCs/>
+                <w:sz w:val="19"/>
+                <w:szCs w:val="19"/>
+              </w:rPr>
+              <w:t xml:space="preserve">Mensaje de usuario</w:t>
+            </w:r>
+          </w:p>
+        </w:tc>
+        <w:tc>
+          <w:tcPr>
+            <w:tcW w:type="dxa" w:w="7273"/>
+            <w:tcMar>
+              <w:top w:type="dxa" w:w="60"/>
+              <w:left w:type="dxa" w:w="110"/>
+              <w:bottom w:type="dxa" w:w="60"/>
+              <w:right w:type="dxa" w:w="110"/>
+            </w:tcMar>
+          </w:tcPr>
+          <w:p>
+            <w:pPr>
+              <w:spacing w:after="0" w:before="0"/>
+            </w:pPr>
+            <w:r>
+              <w:rPr>
+                <w:sz w:val="19"/>
+                <w:szCs w:val="19"/>
+              </w:rPr>
+              <w:t xml:space="preserve">La semana a analizar, las previas, los avisos de la corrida y las tablas en CSV</w:t>
+            </w:r>
+          </w:p>
+        </w:tc>
+        <w:tc>
+          <w:tcPr>
+            <w:tcW w:type="dxa" w:w="1014"/>
+            <w:tcMar>
+              <w:top w:type="dxa" w:w="60"/>
+              <w:left w:type="dxa" w:w="110"/>
+              <w:bottom w:type="dxa" w:w="60"/>
+              <w:right w:type="dxa" w:w="110"/>
+            </w:tcMar>
+          </w:tcPr>
+          <w:p>
+            <w:pPr>
+              <w:spacing w:after="0" w:before="0"/>
+            </w:pPr>
+            <w:r>
+              <w:rPr>
+                <w:sz w:val="19"/>
+                <w:szCs w:val="19"/>
+              </w:rPr>
+              <w:t xml:space="preserve">Cada semana</w:t>
+            </w:r>
+          </w:p>
+        </w:tc>
+      </w:tr>
+      <w:tr>
+        <w:tc>
+          <w:tcPr>
+            <w:tcW w:type="dxa" w:w="1073"/>
+            <w:tcMar>
+              <w:top w:type="dxa" w:w="60"/>
+              <w:left w:type="dxa" w:w="110"/>
+              <w:bottom w:type="dxa" w:w="60"/>
+              <w:right w:type="dxa" w:w="110"/>
+            </w:tcMar>
+          </w:tcPr>
+          <w:p>
+            <w:pPr>
+              <w:spacing w:after="0" w:before="0"/>
+            </w:pPr>
+            <w:r>
+              <w:rPr>
+                <w:b/>
+                <w:bCs/>
+                <w:sz w:val="19"/>
+                <w:szCs w:val="19"/>
+              </w:rPr>
+              <w:t xml:space="preserve">Esquema Pydantic</w:t>
+            </w:r>
+          </w:p>
+        </w:tc>
+        <w:tc>
+          <w:tcPr>
+            <w:tcW w:type="dxa" w:w="7273"/>
+            <w:tcMar>
+              <w:top w:type="dxa" w:w="60"/>
+              <w:left w:type="dxa" w:w="110"/>
+              <w:bottom w:type="dxa" w:w="60"/>
+              <w:right w:type="dxa" w:w="110"/>
+            </w:tcMar>
+          </w:tcPr>
+          <w:p>
+            <w:pPr>
+              <w:spacing w:after="0" w:before="0"/>
+            </w:pPr>
+            <w:r>
+              <w:rPr>
+                <w:sz w:val="19"/>
+                <w:szCs w:val="19"/>
+              </w:rPr>
+              <w:t xml:space="preserve">El formato de la respuesta: cuatro campos, con los rangos ("2 a 5 ítems", "120-180 palabras") en las descripciones</w:t>
+            </w:r>
+          </w:p>
+        </w:tc>
+        <w:tc>
+          <w:tcPr>
+            <w:tcW w:type="dxa" w:w="1014"/>
+            <w:tcMar>
+              <w:top w:type="dxa" w:w="60"/>
+              <w:left w:type="dxa" w:w="110"/>
+              <w:bottom w:type="dxa" w:w="60"/>
+              <w:right w:type="dxa" w:w="110"/>
+            </w:tcMar>
+          </w:tcPr>
+          <w:p>
+            <w:pPr>
+              <w:spacing w:after="0" w:before="0"/>
+            </w:pPr>
+            <w:r>
+              <w:rPr>
+                <w:sz w:val="19"/>
+                <w:szCs w:val="19"/>
+              </w:rPr>
+              <w:t xml:space="preserve">Casi nunca</w:t>
+            </w:r>
+          </w:p>
+        </w:tc>
+      </w:tr>
+    </w:tbl>
+    <w:p>
+      <w:pPr>
+        <w:spacing w:after="140"/>
+      </w:pPr>
+    </w:p>
+    <w:p>
+      <w:pPr>
+        <w:spacing w:after="140" w:before="60" w:line="276"/>
+      </w:pPr>
+      <w:r>
+        <w:t xml:space="preserve">Las cinco decisiones que lo definen:</w:t>
+      </w:r>
+    </w:p>
+    <w:p>
+      <w:pPr>
+        <w:pStyle w:val="ListParagraph"/>
+        <w:numPr>
+          <w:ilvl w:val="0"/>
+          <w:numId w:val="2"/>
+        </w:numPr>
+        <w:spacing w:after="60" w:before="40" w:line="276"/>
+      </w:pPr>
+      <w:r>
+        <w:rPr>
+          <w:b/>
+          <w:bCs/>
+        </w:rPr>
+        <w:t xml:space="preserve">"No tenés que restar nada, usá las cifras como vienen".</w:t>
+      </w:r>
+      <w:r>
+        <w:t xml:space="preserve"> No alcanza con darle las altas calculadas: hay que cerrarle la puerta a que recalcule, porque si no "verifica" restando acumulados y cita su propia cuenta.</w:t>
+      </w:r>
+    </w:p>
+    <w:p>
+      <w:pPr>
+        <w:pStyle w:val="ListParagraph"/>
+        <w:numPr>
+          <w:ilvl w:val="0"/>
+          <w:numId w:val="2"/>
+        </w:numPr>
+        <w:spacing w:after="60" w:before="40" w:line="276"/>
+      </w:pPr>
+      <w:r>
+        <w:rPr>
+          <w:b/>
+          <w:bCs/>
+        </w:rPr>
+        <w:t xml:space="preserve">El glosario es data, no prompt.</w:t>
+      </w:r>
+      <w:r>
+        <w:t xml:space="preserve"> Vive en </w:t>
+      </w:r>
+      <w:r>
+        <w:rPr>
+          <w:rFonts w:ascii="Consolas" w:cs="Consolas" w:eastAsia="Consolas" w:hAnsi="Consolas"/>
+          <w:sz w:val="19"/>
+          <w:szCs w:val="19"/>
+          <w:shd w:fill="F4F4F4" w:val="clear"/>
+        </w:rPr>
+        <w:t xml:space="preserve">casos.py</w:t>
+      </w:r>
+      <w:r>
+        <w:t xml:space="preserve">, junto a las dimensiones y estados que explica. Es lo que evita que el modelo lea mal el vocabulario de un dominio, y lo que permite agregar un dominio sin tocar el prompt.</w:t>
+      </w:r>
+    </w:p>
+    <w:p>
+      <w:pPr>
+        <w:pStyle w:val="ListParagraph"/>
+        <w:numPr>
+          <w:ilvl w:val="0"/>
+          <w:numId w:val="2"/>
+        </w:numPr>
+        <w:spacing w:after="60" w:before="40" w:line="276"/>
+      </w:pPr>
+      <w:r>
+        <w:rPr>
+          <w:b/>
+          <w:bCs/>
+        </w:rPr>
+        <w:t xml:space="preserve">Cada regla de comparación tapa un error concreto</w:t>
+      </w:r>
+      <w:r>
+        <w:t xml:space="preserve">: que el acumulado siempre sube, que los promedios son un nivel y no el resultado de la semana, que la primera fila es la foto base, que con volúmenes chicos los porcentajes exageran, que </w:t>
+      </w:r>
+      <w:r>
+        <w:rPr>
+          <w:rFonts w:ascii="Consolas" w:cs="Consolas" w:eastAsia="Consolas" w:hAnsi="Consolas"/>
+          <w:sz w:val="19"/>
+          <w:szCs w:val="19"/>
+          <w:shd w:fill="F4F4F4" w:val="clear"/>
+        </w:rPr>
+        <w:t xml:space="preserve">SIN_DATO</w:t>
+      </w:r>
+      <w:r>
+        <w:t xml:space="preserve"> es un faltante.</w:t>
+      </w:r>
+    </w:p>
+    <w:p>
+      <w:pPr>
+        <w:pStyle w:val="ListParagraph"/>
+        <w:numPr>
+          <w:ilvl w:val="0"/>
+          <w:numId w:val="2"/>
+        </w:numPr>
+        <w:spacing w:after="60" w:before="40" w:line="276"/>
+      </w:pPr>
+      <w:r>
+        <w:rPr>
+          <w:b/>
+          <w:bCs/>
+        </w:rPr>
+        <w:t xml:space="preserve">El formato lo fija el esquema, no el texto.</w:t>
+      </w:r>
+      <w:r>
+        <w:t xml:space="preserve"> Structured outputs: la estructura no puede fallar y no hay que parsear markdown.</w:t>
+      </w:r>
+    </w:p>
+    <w:p>
+      <w:pPr>
+        <w:pStyle w:val="ListParagraph"/>
+        <w:numPr>
+          <w:ilvl w:val="0"/>
+          <w:numId w:val="2"/>
+        </w:numPr>
+        <w:spacing w:after="60" w:before="40" w:line="276"/>
+      </w:pPr>
+      <w:r>
+        <w:rPr>
+          <w:b/>
+          <w:bCs/>
+        </w:rPr>
+        <w:t xml:space="preserve">Los avisos los calcula el código.</w:t>
+      </w:r>
+      <w:r>
+        <w:t xml:space="preserve"> Si falta el snapshot de una semana, el prompt se lo dice al modelo en vez de dejar que invente una causa para el pico.</w:t>
+      </w:r>
+    </w:p>
+    <w:p>
+      <w:pPr>
+        <w:spacing w:after="140" w:before="60" w:line="276"/>
+      </w:pPr>
+      <w:r>
+        <w:t xml:space="preserve">Detalle completo, con el prompt real de ejemplo: sección 8 de la documentación técnica.</w:t>
       </w:r>
     </w:p>
     <w:p>

</xml_diff>